<commit_message>
Sync v2 with 2026-10-28 script revision
</commit_message>
<xml_diff>
--- a/script/朕的牙疼漫游.docx
+++ b/script/朕的牙疼漫游.docx
@@ -289,7 +289,22 @@
           <w:rFonts w:hint="eastAsia"/>
           <w:lang w:val="en-US" w:eastAsia="zh-CN"/>
         </w:rPr>
-        <w:t>杨正奇、郑硕</w:t>
+        <w:t>杨正奇、</w:t>
+      </w:r>
+      <w:r>
+        <w:rPr>
+          <w:rFonts w:hint="eastAsia"/>
+          <w:lang w:val="en-US" w:eastAsia="zh"/>
+          <w:woUserID w:val="7"/>
+        </w:rPr>
+        <w:t>雷源泽、</w:t>
+      </w:r>
+      <w:r>
+        <w:rPr>
+          <w:rFonts w:hint="eastAsia"/>
+          <w:lang w:val="en-US" w:eastAsia="zh-CN"/>
+        </w:rPr>
+        <w:t>郑硕</w:t>
       </w:r>
       <w:r>
         <w:rPr>
@@ -688,20 +703,22 @@
         <w:rPr>
           <w:rFonts w:hint="eastAsia"/>
         </w:rPr>
-        <w:t>记载，可用中药熏漱、</w:t>
+        <w:t>记载，可用</w:t>
       </w:r>
       <w:r>
         <w:rPr>
           <w:rFonts w:hint="eastAsia"/>
           <w:highlight w:val="yellow"/>
         </w:rPr>
-        <w:t>外敷、针灸暂时止痛。只是牙体已经腐坏深入，本朝没有修补牙体的办法。若要根治，唯有拔牙，非万不得已不能施行。</w:t>
-      </w:r>
-    </w:p>
-    <w:p>
-      <w:pPr>
-        <w:rPr>
-          <w:rFonts w:hint="eastAsia"/>
+        <w:t>中药熏漱、外敷、针灸暂时止痛。只是牙体已经腐坏深入，本朝没有修补牙体的办法。若要根治，唯有拔牙，非万不得已不能施行。</w:t>
+      </w:r>
+    </w:p>
+    <w:p>
+      <w:pPr>
+        <w:rPr>
+          <w:rFonts w:hint="eastAsia"/>
+          <w:lang w:eastAsia="zh"/>
+          <w:woUserID w:val="4"/>
         </w:rPr>
       </w:pPr>
       <w:r>
@@ -737,39 +754,61 @@
         </w:rPr>
         <w:t>？</w:t>
       </w:r>
-    </w:p>
-    <w:p>
-      <w:pPr>
-        <w:rPr>
-          <w:rFonts w:hint="eastAsia"/>
-        </w:rPr>
-      </w:pPr>
-      <w:r>
-        <w:rPr>
-          <w:rFonts w:hint="eastAsia"/>
-        </w:rPr>
-        <w:t>太医：</w:t>
-      </w:r>
-      <w:r>
-        <w:rPr>
-          <w:rFonts w:hint="eastAsia"/>
-          <w:lang w:val="en-US" w:eastAsia="zh-CN"/>
-        </w:rPr>
-        <w:t>这</w:t>
-      </w:r>
-      <w:r>
-        <w:rPr>
-          <w:rFonts w:hint="eastAsia"/>
-          <w:lang w:val="en-US" w:eastAsia="zh"/>
+      <w:r>
+        <w:rPr>
+          <w:rFonts w:hint="eastAsia"/>
+          <w:lang w:eastAsia="zh"/>
+          <w:woUserID w:val="4"/>
+        </w:rPr>
+        <w:t xml:space="preserve"> </w:t>
+      </w:r>
+    </w:p>
+    <w:p>
+      <w:pPr>
+        <w:rPr>
+          <w:rFonts w:hint="eastAsia" w:eastAsiaTheme="minorEastAsia"/>
+          <w:lang w:eastAsia="zh"/>
+          <w:woUserID w:val="4"/>
+        </w:rPr>
+      </w:pPr>
+      <w:r>
+        <w:rPr>
+          <w:rFonts w:hint="eastAsia"/>
+          <w:lang w:eastAsia="zh"/>
+          <w:woUserID w:val="4"/>
+        </w:rPr>
+        <w:t>太医：这……</w:t>
+      </w:r>
+      <w:bookmarkStart w:id="0" w:name="_GoBack"/>
+      <w:bookmarkEnd w:id="0"/>
+      <w:r>
+        <w:rPr>
+          <w:rFonts w:hint="eastAsia"/>
+          <w:lang w:eastAsia="zh"/>
+          <w:woUserID w:val="4"/>
+        </w:rPr>
+        <w:t xml:space="preserve"> </w:t>
+      </w:r>
+    </w:p>
+    <w:p>
+      <w:pPr>
+        <w:rPr>
+          <w:rFonts w:hint="eastAsia"/>
+        </w:rPr>
+      </w:pPr>
+      <w:r>
+        <w:rPr>
+          <w:rFonts w:hint="eastAsia"/>
+          <w:lang w:eastAsia="zh"/>
           <w:woUserID w:val="1"/>
         </w:rPr>
-        <w:t>……</w:t>
-      </w:r>
-      <w:r>
-        <w:rPr>
-          <w:rFonts w:hint="eastAsia"/>
-        </w:rPr>
-        <w:t>陛下，</w:t>
+        <w:t>国师</w:t>
+      </w:r>
+      <w:r>
+        <w:rPr>
+          <w:rFonts w:hint="eastAsia"/>
+        </w:rPr>
+        <w:t>：陛下，</w:t>
       </w:r>
       <w:r>
         <w:rPr>
@@ -864,7 +903,6 @@
           <w:szCs w:val="28"/>
         </w:rPr>
       </w:pPr>
-      <w:bookmarkStart w:id="0" w:name="_GoBack"/>
       <w:r>
         <w:rPr>
           <w:rFonts w:hint="eastAsia"/>
@@ -874,7 +912,6 @@
         <w:t>第二场 公元1400年 法国巴黎 理发外科铺（中世纪欧洲牙科）</w:t>
       </w:r>
     </w:p>
-    <w:bookmarkEnd w:id="0"/>
     <w:p>
       <w:pPr>
         <w:rPr>
@@ -1025,7 +1062,91 @@
         <w:rPr>
           <w:rFonts w:hint="eastAsia"/>
         </w:rPr>
-        <w:t>理发师‑外科匠：镇痛？并无麻药。最多饮烈酒麻痹心神。牙齿蛀坏就只能蛮力拔除，没有补牙一说。若是运气不好，牙龈撕裂、感染发热都是常事。</w:t>
+        <w:t>理发师‑外科匠：镇痛？</w:t>
+      </w:r>
+      <w:r>
+        <w:rPr>
+          <w:rFonts w:hint="eastAsia"/>
+          <w:lang w:eastAsia="zh"/>
+          <w:woUserID w:val="7"/>
+        </w:rPr>
+        <w:t>没有</w:t>
+      </w:r>
+      <w:r>
+        <w:rPr>
+          <w:rFonts w:hint="eastAsia"/>
+        </w:rPr>
+        <w:t>麻药。最多</w:t>
+      </w:r>
+      <w:r>
+        <w:rPr>
+          <w:rFonts w:hint="eastAsia"/>
+          <w:lang w:eastAsia="zh"/>
+          <w:woUserID w:val="7"/>
+        </w:rPr>
+        <w:t>喝些</w:t>
+      </w:r>
+      <w:r>
+        <w:rPr>
+          <w:rFonts w:hint="eastAsia"/>
+        </w:rPr>
+        <w:t>烈酒。牙齿蛀坏</w:t>
+      </w:r>
+      <w:r>
+        <w:rPr>
+          <w:rFonts w:hint="eastAsia"/>
+          <w:lang w:eastAsia="zh"/>
+          <w:woUserID w:val="7"/>
+        </w:rPr>
+        <w:t>了</w:t>
+      </w:r>
+      <w:r>
+        <w:rPr>
+          <w:rFonts w:hint="eastAsia"/>
+        </w:rPr>
+        <w:t>只能蛮力拔除，没有补牙</w:t>
+      </w:r>
+      <w:r>
+        <w:rPr>
+          <w:rFonts w:hint="eastAsia"/>
+          <w:lang w:eastAsia="zh"/>
+          <w:woUserID w:val="7"/>
+        </w:rPr>
+        <w:t>的说法</w:t>
+      </w:r>
+      <w:r>
+        <w:rPr>
+          <w:rFonts w:hint="eastAsia"/>
+        </w:rPr>
+        <w:t>。</w:t>
+      </w:r>
+      <w:r>
+        <w:rPr>
+          <w:rFonts w:hint="eastAsia"/>
+          <w:lang w:eastAsia="zh"/>
+          <w:woUserID w:val="7"/>
+        </w:rPr>
+        <w:t>要是运</w:t>
+      </w:r>
+      <w:r>
+        <w:rPr>
+          <w:rFonts w:hint="eastAsia"/>
+        </w:rPr>
+        <w:t>气不好，牙龈撕裂、感染发热都是常</w:t>
+      </w:r>
+      <w:r>
+        <w:rPr>
+          <w:rFonts w:hint="eastAsia"/>
+          <w:lang w:eastAsia="zh"/>
+          <w:woUserID w:val="7"/>
+        </w:rPr>
+        <w:t>有的事</w:t>
+      </w:r>
+      <w:r>
+        <w:rPr>
+          <w:rFonts w:hint="eastAsia"/>
+        </w:rPr>
+        <w:t>。</w:t>
       </w:r>
     </w:p>
     <w:p>
@@ -1518,7 +1639,21 @@
         <w:rPr>
           <w:rFonts w:hint="eastAsia"/>
         </w:rPr>
-        <w:t>皇帝：笑气固然可以消除疼痛，但依旧只能把牙齿拔掉，不能将坏牙修补复原。朕不愿舍弃这颗牙，我们继续向前。</w:t>
+        <w:t>皇帝：笑气固然可以消除疼痛，但依旧只能把牙齿拔掉，不能将坏牙修补复原。朕不愿舍弃这颗牙，我们继续</w:t>
+      </w:r>
+      <w:r>
+        <w:rPr>
+          <w:rFonts w:hint="eastAsia"/>
+          <w:lang w:eastAsia="zh"/>
+          <w:woUserID w:val="7"/>
+        </w:rPr>
+        <w:t>向未来走</w:t>
+      </w:r>
+      <w:r>
+        <w:rPr>
+          <w:rFonts w:hint="eastAsia"/>
+        </w:rPr>
+        <w:t>。</w:t>
       </w:r>
     </w:p>
     <w:p>
@@ -1853,7 +1988,7 @@
         <w:rPr>
           <w:rFonts w:hint="eastAsia"/>
         </w:rPr>
-        <w:t>牙医：是的。我们先做局部麻醉，治疗区域会失去痛感，您全程保持清醒。治疗器械全部高温灭菌，规避感染风险。</w:t>
+        <w:t>牙医：是的。我们先做局部麻醉，治疗区域会失去痛感，您全程保持清醒。治疗器械全部灭菌，规避感染风险。</w:t>
       </w:r>
     </w:p>
     <w:p>
@@ -2038,8 +2173,16 @@
       <w:r>
         <w:rPr>
           <w:rFonts w:hint="eastAsia"/>
-        </w:rPr>
-        <w:t>皇帝（面向台下观众，作为课程汇报总结）：</w:t>
+          <w:lang w:eastAsia="zh"/>
+          <w:woUserID w:val="7"/>
+        </w:rPr>
+        <w:t>旁白：</w:t>
+      </w:r>
+      <w:r>
+        <w:rPr>
+          <w:rFonts w:hint="eastAsia"/>
+        </w:rPr>
+        <w:t>（面向台下观众，作为课程汇报总结）</w:t>
       </w:r>
     </w:p>
     <w:p>
@@ -2339,7 +2482,7 @@
     <w:lsdException w:unhideWhenUsed="0" w:uiPriority="0" w:semiHidden="0" w:name="Document Map"/>
     <w:lsdException w:unhideWhenUsed="0" w:uiPriority="0" w:semiHidden="0" w:name="Plain Text"/>
     <w:lsdException w:unhideWhenUsed="0" w:uiPriority="0" w:semiHidden="0" w:name="E-mail Signature"/>
-    <w:lsdException w:unhideWhenUsed="0" w:uiPriority="0" w:semiHidden="0" w:name="Normal (Web)"/>
+    <w:lsdException w:qFormat="1" w:unhideWhenUsed="0" w:uiPriority="0" w:semiHidden="0" w:name="Normal (Web)"/>
     <w:lsdException w:unhideWhenUsed="0" w:uiPriority="0" w:semiHidden="0" w:name="HTML Acronym"/>
     <w:lsdException w:unhideWhenUsed="0" w:uiPriority="0" w:semiHidden="0" w:name="HTML Address"/>
     <w:lsdException w:unhideWhenUsed="0" w:uiPriority="0" w:semiHidden="0" w:name="HTML Cite"/>
@@ -2535,6 +2678,7 @@
   <w:style w:type="paragraph" w:styleId="2">
     <w:name w:val="Normal (Web)"/>
     <w:basedOn w:val="1"/>
+    <w:qFormat/>
     <w:uiPriority w:val="0"/>
     <w:pPr>
       <w:spacing w:before="0" w:beforeAutospacing="1" w:after="0" w:afterAutospacing="1"/>

</xml_diff>